<commit_message>
fix(network): bootstrap cloud accounts and retarget units
</commit_message>
<xml_diff>
--- a/docs/INTERNET_ROOM_NETWORKING.docx
+++ b/docs/INTERNET_ROOM_NETWORKING.docx
@@ -74,7 +74,7 @@
           <w:color w:val="17365D"/>
           <w:sz w:val="21"/>
         </w:rPr>
-        <w:t xml:space="preserve">状态：首版实现基线。目标是让不同网络中的玩家通过公网加入玩家创建的 </w:t>
+        <w:t xml:space="preserve">状态：v1.4 实现基线。目标是让不同网络中的玩家通过公网加入玩家创建的 </w:t>
       </w:r>
       <w:r>
         <w:rPr>
@@ -94,7 +94,7 @@
           <w:color w:val="17365D"/>
           <w:sz w:val="21"/>
         </w:rPr>
-        <w:t xml:space="preserve"> 房间。本文只定义联网边界和验收口径，不改变现有房间地图、联盟、战斗、结算与淘汰规则。</w:t>
+        <w:t xml:space="preserve"> 房间，并在首次连接时安全创建云端设备账号。本文只定义联网边界和验收口径，不改变现有房间地图、联盟、战斗、结算与淘汰规则。</w:t>
       </w:r>
     </w:p>
     <w:p>
@@ -316,7 +316,7 @@
           <w:color w:val="202124"/>
           <w:sz w:val="22"/>
         </w:rPr>
-        <w:t>不做公开房间列表、自动匹配、好友系统、账号体系、观战和中途补位。</w:t>
+        <w:t>不做公开房间列表、自动匹配、好友系统、跨设备账号找回、观战和中途补位。</w:t>
       </w:r>
     </w:p>
     <w:p>
@@ -2271,7 +2271,7 @@
           <w:color w:val="202124"/>
           <w:sz w:val="22"/>
         </w:rPr>
-        <w:t>房间码在最后一名真人离开或服务器重启后失效。首版没有账号身份和重连令牌。</w:t>
+        <w:t>房间码在最后一名真人离开或服务器重启后失效。v1.1 时没有账号身份和重连令牌；v1.4 已实现设备账号和长期登录令牌（见第 15 节），但尚未提供房间内断线重连令牌。</w:t>
       </w:r>
     </w:p>
     <w:p>
@@ -4764,7 +4764,7 @@
           <w:color w:val="202124"/>
           <w:sz w:val="22"/>
         </w:rPr>
-        <w:t>会话令牌、宽限期原槽位恢复和服务端战局持久化属于后续增强，不能在首版 UI 中宣称已经支持。</w:t>
+        <w:t>房间断线重连令牌、宽限期原槽位恢复和服务端战局持久化属于后续增强，不能在首版 UI 中宣称已经支持；设备账号的登录令牌已按第 15 节实现，且不得写入业务日志。</w:t>
       </w:r>
     </w:p>
     <w:p>
@@ -5974,7 +5974,7 @@
           <w:color w:val="202124"/>
           <w:sz w:val="22"/>
         </w:rPr>
-        <w:t>增加最小化业务事件日志，可记录连接 ID、房间码/比赛 ID 和错误类别；不要记录完整 IP 展示、原始网络包或客户端隐私数据。当前实现没有会话令牌和聊天系统。</w:t>
+        <w:t>增加最小化业务事件日志，可记录连接 ID、房间码/比赛 ID 和错误类别；不要记录完整 IP 展示、原始网络包、长期登录令牌、会话令牌或客户端隐私数据。当前实现没有聊天系统。</w:t>
       </w:r>
     </w:p>
     <w:p>
@@ -6404,7 +6404,7 @@
           <w:color w:val="202124"/>
           <w:sz w:val="22"/>
         </w:rPr>
-        <w:t>账号身份、会话令牌、重连令牌、原槽位宽限期与跨服务端进程恢复。</w:t>
+        <w:t>房间断线重连令牌、原槽位宽限期与跨服务端进程恢复。</w:t>
       </w:r>
     </w:p>
     <w:p>
@@ -9050,7 +9050,7 @@
           <w:color w:val="202124"/>
           <w:sz w:val="22"/>
         </w:rPr>
-        <w:t xml:space="preserve">已验证：Linux 专服归档 SHA-256 为 </w:t>
+        <w:t xml:space="preserve">已验证：当前 Linux 专服归档 </w:t>
       </w:r>
       <w:r>
         <w:rPr>
@@ -9060,7 +9060,7 @@
           <w:color w:val="17365D"/>
           <w:sz w:val="22"/>
         </w:rPr>
-        <w:t>725CA380EB20A06A8CB33DD4400C370B4DB7E290C24AA6F578EF12DEACE0D7A5</w:t>
+        <w:t>junglelaw-server-20260722-account-cloud-target-retarget.tar.gz</w:t>
       </w:r>
       <w:r>
         <w:rPr>
@@ -9070,7 +9070,47 @@
           <w:color w:val="202124"/>
           <w:sz w:val="22"/>
         </w:rPr>
-        <w:t>，本机到公网地址的纯 ENet 握手成功。</w:t>
+        <w:t xml:space="preserve"> 的 SHA-256 为 </w:t>
+      </w:r>
+      <w:r>
+        <w:rPr>
+          <w:rFonts w:ascii="Calibri" w:hAnsi="Calibri" w:eastAsia="Microsoft YaHei"/>
+          <w:b/>
+          <w:i w:val="0"/>
+          <w:color w:val="17365D"/>
+          <w:sz w:val="22"/>
+        </w:rPr>
+        <w:t>997A246A04E0556AEDABCBA72637E2A37C67699B066E54A1C5DA362C446176B5</w:t>
+      </w:r>
+      <w:r>
+        <w:rPr>
+          <w:rFonts w:ascii="Calibri" w:hAnsi="Calibri" w:eastAsia="Microsoft YaHei"/>
+          <w:b w:val="0"/>
+          <w:i w:val="0"/>
+          <w:color w:val="202124"/>
+          <w:sz w:val="22"/>
+        </w:rPr>
+        <w:t xml:space="preserve">，已安装二进制 SHA-256 为 </w:t>
+      </w:r>
+      <w:r>
+        <w:rPr>
+          <w:rFonts w:ascii="Calibri" w:hAnsi="Calibri" w:eastAsia="Microsoft YaHei"/>
+          <w:b/>
+          <w:i w:val="0"/>
+          <w:color w:val="17365D"/>
+          <w:sz w:val="22"/>
+        </w:rPr>
+        <w:t>BB7AEA296E48DE23439E057CF9C6FF72E4075436C9FFCA0381FC29BBEF95E649</w:t>
+      </w:r>
+      <w:r>
+        <w:rPr>
+          <w:rFonts w:ascii="Calibri" w:hAnsi="Calibri" w:eastAsia="Microsoft YaHei"/>
+          <w:b w:val="0"/>
+          <w:i w:val="0"/>
+          <w:color w:val="202124"/>
+          <w:sz w:val="22"/>
+        </w:rPr>
+        <w:t>；本机到公网地址的纯 ENet 握手成功。</w:t>
       </w:r>
     </w:p>
     <w:p>
@@ -9086,6 +9126,331 @@
           <w:sz w:val="22"/>
         </w:rPr>
         <w:t>数据迁移：本机玩家账号、卡牌、星级、卡组、抽卡券、战绩和分析数据未上传；如需迁移，仍须在传输前单独授权。</w:t>
+      </w:r>
+    </w:p>
+    <w:p>
+      <w:pPr>
+        <w:pStyle w:val="Heading1"/>
+      </w:pPr>
+      <w:r>
+        <w:rPr>
+          <w:rFonts w:ascii="Calibri" w:hAnsi="Calibri" w:eastAsia="Microsoft YaHei"/>
+          <w:b w:val="0"/>
+          <w:i w:val="0"/>
+          <w:color w:val="2E74B5"/>
+          <w:sz w:val="32"/>
+        </w:rPr>
+        <w:t>15. 账号云端首次引导与令牌作用域（v1.4）</w:t>
+      </w:r>
+    </w:p>
+    <w:p>
+      <w:pPr>
+        <w:pStyle w:val="Heading2"/>
+      </w:pPr>
+      <w:r>
+        <w:rPr>
+          <w:rFonts w:ascii="Calibri" w:hAnsi="Calibri" w:eastAsia="Microsoft YaHei"/>
+          <w:b w:val="0"/>
+          <w:i w:val="0"/>
+          <w:color w:val="2E74B5"/>
+          <w:sz w:val="26"/>
+        </w:rPr>
+        <w:t>15.1 玩家可见规则</w:t>
+      </w:r>
+    </w:p>
+    <w:p>
+      <w:pPr>
+        <w:pStyle w:val="ListBullet"/>
+      </w:pPr>
+      <w:r>
+        <w:rPr>
+          <w:rFonts w:ascii="Calibri" w:hAnsi="Calibri" w:eastAsia="Microsoft YaHei"/>
+          <w:b w:val="0"/>
+          <w:i w:val="0"/>
+          <w:color w:val="202124"/>
+          <w:sz w:val="22"/>
+        </w:rPr>
+        <w:t>游戏进入大厅后会自动连接配置的联网服务器；首次启动不再要求玩家先打开基地或先拥有旧登录令牌。</w:t>
+      </w:r>
+    </w:p>
+    <w:p>
+      <w:pPr>
+        <w:pStyle w:val="ListBullet"/>
+      </w:pPr>
+      <w:r>
+        <w:rPr>
+          <w:rFonts w:ascii="Calibri" w:hAnsi="Calibri" w:eastAsia="Microsoft YaHei"/>
+          <w:b w:val="0"/>
+          <w:i w:val="0"/>
+          <w:color w:val="202124"/>
+          <w:sz w:val="22"/>
+        </w:rPr>
+        <w:t>首次连到一个尚未记录该安装、且客户端没有携带旧令牌的服务器时，服务器会创建一个默认设备账号、不可修改的 UserID 和一份新的服务器侧新手资料，并签发新的长期登录令牌。玩家打开主页面基地即可查看 UserID 和“服务器已同步”状态。</w:t>
+      </w:r>
+    </w:p>
+    <w:p>
+      <w:pPr>
+        <w:pStyle w:val="ListBullet"/>
+      </w:pPr>
+      <w:r>
+        <w:rPr>
+          <w:rFonts w:ascii="Calibri" w:hAnsi="Calibri" w:eastAsia="Microsoft YaHei"/>
+          <w:b w:val="0"/>
+          <w:i w:val="0"/>
+          <w:color w:val="202124"/>
+          <w:sz w:val="22"/>
+        </w:rPr>
+        <w:t>账号与密码注册仍可用于建立可手动登录的命名账号；注册成功后会立刻用同一密码登录并绑定当前安装。账号密码不写入本机文件。</w:t>
+      </w:r>
+    </w:p>
+    <w:p>
+      <w:pPr>
+        <w:pStyle w:val="ListBullet"/>
+      </w:pPr>
+      <w:r>
+        <w:rPr>
+          <w:rFonts w:ascii="Calibri" w:hAnsi="Calibri" w:eastAsia="Microsoft YaHei"/>
+          <w:b w:val="0"/>
+          <w:i w:val="0"/>
+          <w:color w:val="202124"/>
+          <w:sz w:val="22"/>
+        </w:rPr>
+        <w:t>卡牌、星级、卡组、抽卡券和战绩只以新服务器资料为准。已有电脑上的本地资料不会因这次首次云端引导而上传、覆盖或合并。</w:t>
+      </w:r>
+    </w:p>
+    <w:p>
+      <w:pPr>
+        <w:pStyle w:val="Heading2"/>
+      </w:pPr>
+      <w:r>
+        <w:rPr>
+          <w:rFonts w:ascii="Calibri" w:hAnsi="Calibri" w:eastAsia="Microsoft YaHei"/>
+          <w:b w:val="0"/>
+          <w:i w:val="0"/>
+          <w:color w:val="2E74B5"/>
+          <w:sz w:val="26"/>
+        </w:rPr>
+        <w:t>15.2 安全边界</w:t>
+      </w:r>
+    </w:p>
+    <w:p>
+      <w:pPr>
+        <w:pStyle w:val="ListBullet"/>
+      </w:pPr>
+      <w:r>
+        <w:rPr>
+          <w:rFonts w:ascii="Calibri" w:hAnsi="Calibri" w:eastAsia="Microsoft YaHei"/>
+          <w:b w:val="0"/>
+          <w:i w:val="0"/>
+          <w:color w:val="202124"/>
+          <w:sz w:val="22"/>
+        </w:rPr>
+        <w:t xml:space="preserve">安装 ID 是本机生成的 32 字节随机值，保持不变；长期登录令牌只对一个标准化的 </w:t>
+      </w:r>
+      <w:r>
+        <w:rPr>
+          <w:rFonts w:ascii="Calibri" w:hAnsi="Calibri" w:eastAsia="Microsoft YaHei"/>
+          <w:b/>
+          <w:i w:val="0"/>
+          <w:color w:val="17365D"/>
+          <w:sz w:val="22"/>
+        </w:rPr>
+        <w:t>server_host:server_port</w:t>
+      </w:r>
+      <w:r>
+        <w:rPr>
+          <w:rFonts w:ascii="Calibri" w:hAnsi="Calibri" w:eastAsia="Microsoft YaHei"/>
+          <w:b w:val="0"/>
+          <w:i w:val="0"/>
+          <w:color w:val="202124"/>
+          <w:sz w:val="22"/>
+        </w:rPr>
+        <w:t xml:space="preserve"> 生效。本机切换服务器地址或升级旧版凭据时，会保留安装 ID、清除旧令牌，再向新服务器申请新令牌。</w:t>
+      </w:r>
+    </w:p>
+    <w:p>
+      <w:pPr>
+        <w:pStyle w:val="ListBullet"/>
+      </w:pPr>
+      <w:r>
+        <w:rPr>
+          <w:rFonts w:ascii="Calibri" w:hAnsi="Calibri" w:eastAsia="Microsoft YaHei"/>
+          <w:b w:val="0"/>
+          <w:i w:val="0"/>
+          <w:color w:val="202124"/>
+          <w:sz w:val="22"/>
+        </w:rPr>
+        <w:t>对于服务器从未见过的安装 ID，如果请求仍携带非空令牌，服务器会拒绝该请求，绝不接受、复用或以任意令牌开户。客户端会在切换地址或发现旧版凭据时先清空令牌，因此首次云端认证实际发送的是空令牌。</w:t>
+      </w:r>
+    </w:p>
+    <w:p>
+      <w:pPr>
+        <w:pStyle w:val="ListBullet"/>
+      </w:pPr>
+      <w:r>
+        <w:rPr>
+          <w:rFonts w:ascii="Calibri" w:hAnsi="Calibri" w:eastAsia="Microsoft YaHei"/>
+          <w:b w:val="0"/>
+          <w:i w:val="0"/>
+          <w:color w:val="202124"/>
+          <w:sz w:val="22"/>
+        </w:rPr>
+        <w:t>对于服务器已经记录的安装 ID，错误、过期或缺失的令牌同样会被拒绝，不能冒充已有账号。手动账号密码登录是显式的恢复路径：密码校验成功后才允许把命名账号绑定到新安装或轮换该安装的长期令牌。</w:t>
+      </w:r>
+    </w:p>
+    <w:p>
+      <w:pPr>
+        <w:pStyle w:val="ListBullet"/>
+      </w:pPr>
+      <w:r>
+        <w:rPr>
+          <w:rFonts w:ascii="Calibri" w:hAnsi="Calibri" w:eastAsia="Microsoft YaHei"/>
+          <w:b w:val="0"/>
+          <w:i w:val="0"/>
+          <w:color w:val="202124"/>
+          <w:sz w:val="22"/>
+        </w:rPr>
+        <w:t>服务端只保存安装 ID 摘要、随机盐和令牌哈希，不保存安装 ID、长期令牌或密码明文。</w:t>
+      </w:r>
+    </w:p>
+    <w:p>
+      <w:pPr>
+        <w:pStyle w:val="Heading2"/>
+      </w:pPr>
+      <w:r>
+        <w:rPr>
+          <w:rFonts w:ascii="Calibri" w:hAnsi="Calibri" w:eastAsia="Microsoft YaHei"/>
+          <w:b w:val="0"/>
+          <w:i w:val="0"/>
+          <w:color w:val="2E74B5"/>
+          <w:sz w:val="26"/>
+        </w:rPr>
+        <w:t>15.3 实施任务与验收</w:t>
+      </w:r>
+    </w:p>
+    <w:p>
+      <w:pPr>
+        <w:pStyle w:val="ListBullet"/>
+      </w:pPr>
+      <w:r>
+        <w:rPr>
+          <w:rFonts w:ascii="Calibri" w:hAnsi="Calibri" w:eastAsia="Microsoft YaHei"/>
+          <w:b w:val="0"/>
+          <w:i w:val="0"/>
+          <w:color w:val="202124"/>
+          <w:sz w:val="22"/>
+        </w:rPr>
+        <w:t>任务：</w:t>
+      </w:r>
+      <w:r>
+        <w:rPr>
+          <w:rFonts w:ascii="Calibri" w:hAnsi="Calibri" w:eastAsia="Microsoft YaHei"/>
+          <w:b/>
+          <w:i w:val="0"/>
+          <w:color w:val="17365D"/>
+          <w:sz w:val="22"/>
+        </w:rPr>
+        <w:t>ACCOUNT-CLOUD-BOOTSTRAP</w:t>
+      </w:r>
+      <w:r>
+        <w:rPr>
+          <w:rFonts w:ascii="Calibri" w:hAnsi="Calibri" w:eastAsia="Microsoft YaHei"/>
+          <w:b w:val="0"/>
+          <w:i w:val="0"/>
+          <w:color w:val="202124"/>
+          <w:sz w:val="22"/>
+        </w:rPr>
+        <w:t xml:space="preserve"> v1.4；工程责任范围为 </w:t>
+      </w:r>
+      <w:r>
+        <w:rPr>
+          <w:rFonts w:ascii="Calibri" w:hAnsi="Calibri" w:eastAsia="Microsoft YaHei"/>
+          <w:b/>
+          <w:i w:val="0"/>
+          <w:color w:val="17365D"/>
+          <w:sz w:val="22"/>
+        </w:rPr>
+        <w:t>OnlineRoom</w:t>
+      </w:r>
+      <w:r>
+        <w:rPr>
+          <w:rFonts w:ascii="Calibri" w:hAnsi="Calibri" w:eastAsia="Microsoft YaHei"/>
+          <w:b w:val="0"/>
+          <w:i w:val="0"/>
+          <w:color w:val="202124"/>
+          <w:sz w:val="22"/>
+        </w:rPr>
+        <w:t xml:space="preserve"> 客户端凭据作用域、</w:t>
+      </w:r>
+      <w:r>
+        <w:rPr>
+          <w:rFonts w:ascii="Calibri" w:hAnsi="Calibri" w:eastAsia="Microsoft YaHei"/>
+          <w:b/>
+          <w:i w:val="0"/>
+          <w:color w:val="17365D"/>
+          <w:sz w:val="22"/>
+        </w:rPr>
+        <w:t>PlayerAccountStore</w:t>
+      </w:r>
+      <w:r>
+        <w:rPr>
+          <w:rFonts w:ascii="Calibri" w:hAnsi="Calibri" w:eastAsia="Microsoft YaHei"/>
+          <w:b w:val="0"/>
+          <w:i w:val="0"/>
+          <w:color w:val="202124"/>
+          <w:sz w:val="22"/>
+        </w:rPr>
+        <w:t xml:space="preserve"> 设备/命名账号绑定、</w:t>
+      </w:r>
+      <w:r>
+        <w:rPr>
+          <w:rFonts w:ascii="Calibri" w:hAnsi="Calibri" w:eastAsia="Microsoft YaHei"/>
+          <w:b/>
+          <w:i w:val="0"/>
+          <w:color w:val="17365D"/>
+          <w:sz w:val="22"/>
+        </w:rPr>
+        <w:t>Main</w:t>
+      </w:r>
+      <w:r>
+        <w:rPr>
+          <w:rFonts w:ascii="Calibri" w:hAnsi="Calibri" w:eastAsia="Microsoft YaHei"/>
+          <w:b w:val="0"/>
+          <w:i w:val="0"/>
+          <w:color w:val="202124"/>
+          <w:sz w:val="22"/>
+        </w:rPr>
+        <w:t xml:space="preserve"> 启动连接和账户提示。</w:t>
+      </w:r>
+    </w:p>
+    <w:p>
+      <w:pPr>
+        <w:pStyle w:val="ListBullet"/>
+      </w:pPr>
+      <w:r>
+        <w:rPr>
+          <w:rFonts w:ascii="Calibri" w:hAnsi="Calibri" w:eastAsia="Microsoft YaHei"/>
+          <w:b w:val="0"/>
+          <w:i w:val="0"/>
+          <w:color w:val="202124"/>
+          <w:sz w:val="22"/>
+        </w:rPr>
+        <w:t>非目标：不迁移现有本机玩家档案，不改变房间战斗逻辑，不将账号密码持久化到客户端。</w:t>
+      </w:r>
+    </w:p>
+    <w:p>
+      <w:pPr>
+        <w:pStyle w:val="ListBullet"/>
+      </w:pPr>
+      <w:r>
+        <w:rPr>
+          <w:rFonts w:ascii="Calibri" w:hAnsi="Calibri" w:eastAsia="Microsoft YaHei"/>
+          <w:b w:val="0"/>
+          <w:i w:val="0"/>
+          <w:color w:val="202124"/>
+          <w:sz w:val="22"/>
+        </w:rPr>
+        <w:t>自动验收：空凭据首次连接能获得新 UserID 与新令牌；旧服务器令牌切到新服务器前会在客户端清除，再获得新的空白服务器账号；未知或已知安装上的错误令牌仍被拒绝；注册/正确密码登录能完成绑定；错误密码仍被拒绝；首次启动即发起连接。</w:t>
       </w:r>
     </w:p>
     <w:sectPr>

</xml_diff>